<commit_message>
feat: add sello to remaining 19 templates (fianzas, pliegos, portadas)
Co-Authored-By: Claude Opus 4.6 <noreply@anthropic.com>
</commit_message>
<xml_diff>
--- a/resources/form_templates/aseguradoras/DCS-FO-OP-010_SOLICITUD_DE_FIANZAS_DOMINICANA_DE_SEGUROS.docx
+++ b/resources/form_templates/aseguradoras/DCS-FO-OP-010_SOLICITUD_DE_FIANZAS_DOMINICANA_DE_SEGUROS.docx
@@ -3652,6 +3652,17 @@
       <w:pgMar w:top="1580" w:right="1160" w:bottom="280" w:left="900" w:header="720" w:footer="720" w:gutter="0"/>
       <w:cols w:space="720"/>
     </w:sectPr>
+    <w:p>
+      <w:pPr>
+        <w:jc w:val="center"/>
+      </w:pPr>
+      <w:r>
+        <w:rPr>
+          <w:sz w:val="20"/>
+        </w:rPr>
+        <w:t>${img_sello}</w:t>
+      </w:r>
+    </w:p>
   </w:body>
 </w:document>
 </file>

</xml_diff>

<commit_message>
feat: place firma and sello side by side in all templates
- Replace stacked firma/sello with borderless 2-column table layout
- Add firma to 38 templates that only had sello
- Fix 6 templates where sello was appended on a separate page
- 2 fianza templates skipped (fillable forms, no PhpWord tokens)

Co-Authored-By: Claude Opus 4.6 <noreply@anthropic.com>
</commit_message>
<xml_diff>
--- a/resources/form_templates/aseguradoras/DCS-FO-OP-010_SOLICITUD_DE_FIANZAS_DOMINICANA_DE_SEGUROS.docx
+++ b/resources/form_templates/aseguradoras/DCS-FO-OP-010_SOLICITUD_DE_FIANZAS_DOMINICANA_DE_SEGUROS.docx
@@ -3652,17 +3652,50 @@
       <w:pgMar w:top="1580" w:right="1160" w:bottom="280" w:left="900" w:header="720" w:footer="720" w:gutter="0"/>
       <w:cols w:space="720"/>
     </w:sectPr>
-    <w:p>
-      <w:pPr>
+    <w:tbl>
+      <w:tblPr>
+        <w:tblW w:w="0" w:type="auto"/>
+        <w:tblBorders>
+          <w:top w:val="none" w:sz="0" w:space="0" w:color="auto"/>
+          <w:left w:val="none" w:sz="0" w:space="0" w:color="auto"/>
+          <w:bottom w:val="none" w:sz="0" w:space="0" w:color="auto"/>
+          <w:right w:val="none" w:sz="0" w:space="0" w:color="auto"/>
+          <w:insideH w:val="none" w:sz="0" w:space="0" w:color="auto"/>
+          <w:insideV w:val="none" w:sz="0" w:space="0" w:color="auto"/>
+        </w:tblBorders>
         <w:jc w:val="center"/>
-      </w:pPr>
-      <w:r>
-        <w:rPr>
-          <w:sz w:val="20"/>
-        </w:rPr>
-        <w:t>${img_sello}</w:t>
-      </w:r>
-    </w:p>
+      </w:tblPr>
+      <w:tr>
+        <w:tc>
+          <w:tcPr>
+            <w:tcW w:w="4800" w:type="dxa"/>
+            <w:vAlign w:val="bottom"/>
+          </w:tcPr>
+          <w:p>
+            <w:pPr>
+              <w:jc w:val="center"/>
+            </w:pPr>
+            <w:r>
+              <w:t>${img_firma}</w:t>
+            </w:r>
+          </w:p>
+        </w:tc>
+        <w:tc>
+          <w:tcPr>
+            <w:tcW w:w="4800" w:type="dxa"/>
+            <w:vAlign w:val="bottom"/>
+          </w:tcPr>
+          <w:p>
+            <w:pPr>
+              <w:jc w:val="center"/>
+            </w:pPr>
+            <w:r>
+              <w:t>${img_sello}</w:t>
+            </w:r>
+          </w:p>
+        </w:tc>
+      </w:tr>
+    </w:tbl>
   </w:body>
 </w:document>
 </file>

</xml_diff>

<commit_message>
fix: remove all hardcoded client data from templates, apply dateTokens globally
CRITICAL multi-tenancy fix:
- Remove hardcoded cedula (402-1119954-8) from 6 templates → ${rep_cedula}
- Remove hardcoded phone (8095600459) from 5 templates → ${empresa_telefono}
- Remove hardcoded dates (18/03/2026, "dieciocho días de marzo") from 18 templates → date tokens
- Remove hardcoded cargo ("gerente"/"presidente") from 5 templates → ${rep_cargo}
- Fix copy-paste error ("Superintendencia del Mercado de Valores") in Debida Diligencia
- Tokenize D038 expediente number and entity header
- Add ${entidad_nombre} to 8 templates with "Nombre del Capitulo" placeholder
- Apply dateTokens() to ALL form builders and fallback path
- Add fecha_larga, ciudad, provincia to dateTokens()

68/68 templates verified clean of hardcoded client data.

Co-Authored-By: Claude Opus 4.6 <noreply@anthropic.com>
</commit_message>
<xml_diff>
--- a/resources/form_templates/aseguradoras/DCS-FO-OP-010_SOLICITUD_DE_FIANZAS_DOMINICANA_DE_SEGUROS.docx
+++ b/resources/form_templates/aseguradoras/DCS-FO-OP-010_SOLICITUD_DE_FIANZAS_DOMINICANA_DE_SEGUROS.docx
@@ -522,7 +522,7 @@
           <w:rFonts w:ascii="Times New Roman"/>
           <w:u w:val="single" w:color="000000"/>
         </w:rPr>
-        <w:t xml:space="preserve">18/03/2026</w:t>
+        <w:t xml:space="preserve">${fecha}</w:t>
       </w:r>
       <w:r>
         <w:rPr>
@@ -928,7 +928,7 @@
                       <w:u w:val="single" w:color="000000"/>
                       <w:lang w:val="es-DO"/>
                     </w:rPr>
-                    <w:t xml:space="preserve">8095600459</w:t>
+                    <w:t xml:space="preserve">${empresa_telefono}</w:t>
                   </w:r>
                   <w:r>
                     <w:rPr>
@@ -1313,7 +1313,7 @@
                       <w:sz w:val="21"/>
                       <w:lang w:val="es-DO"/>
                     </w:rPr>
-                    <w:t xml:space="preserve">402-1119954-8</w:t>
+                    <w:t xml:space="preserve">${rep_cedula}</w:t>
                   </w:r>
                 </w:p>
                 <w:p>
@@ -1423,7 +1423,7 @@
                       <w:sz w:val="20"/>
                       <w:lang w:val="es-DO"/>
                     </w:rPr>
-                    <w:t xml:space="preserve">8095600459</w:t>
+                    <w:t xml:space="preserve">${empresa_telefono}</w:t>
                   </w:r>
                   <w:r>
                     <w:rPr>
@@ -1728,7 +1728,7 @@
           <w:u w:val="single"/>
           <w:lang w:val="es-DO"/>
         </w:rPr>
-        <w:t xml:space="preserve">18/03/2026</w:t>
+        <w:t xml:space="preserve">${fecha}</w:t>
       </w:r>
       <w:r>
         <w:rPr>

</xml_diff>